<commit_message>
Rampingkan artikel: 4 gambar esensial (grid) + prosa dipadatkan, 4 hlm placeholder (sisakan ruang gambar)
</commit_message>
<xml_diff>
--- a/docs/artikel/artikel_ilmiah_sia.docx
+++ b/docs/artikel/artikel_ilmiah_sia.docx
@@ -167,23 +167,7 @@
           <w:i w:val="0"/>
           <w:sz w:val="20"/>
         </w:rPr>
-        <w:t>Untuk mengatasi permasalahan tersebut, penelitian ini membangun sebuah SIA berbasis web yang mengotomatiskan proses penjurnalan pada level basis data menggunakan mekanisme database trigger. Dengan pendekatan ini, setiap transaksi yang dimasukkan akan secara otomatis membentuk entri pada buku jurnal tanpa intervensi manual, sehingga konsistensi data terjaga. Studi kasus yang digunakan adalah TechSolve Consulting, sebuah UMKM fiktif yang bergerak di bidang jasa konsultan teknologi informasi.</w:t>
-      </w:r>
-    </w:p>
-    <w:p>
-      <w:pPr>
-        <w:spacing w:line="240" w:lineRule="auto" w:before="0" w:after="80"/>
-        <w:ind w:firstLine="425"/>
-        <w:jc w:val="both"/>
-      </w:pPr>
-      <w:r>
-        <w:rPr>
-          <w:rFonts w:ascii="Times New Roman" w:hAnsi="Times New Roman"/>
-          <w:b w:val="0"/>
-          <w:i w:val="0"/>
-          <w:sz w:val="20"/>
-        </w:rPr>
-        <w:t>Tujuan penelitian ini adalah merancang dan mengimplementasikan SIA berbasis web dengan otomatisasi penjurnalan berbasis trigger, serta menguji keandalannya dalam menjaga prinsip double-entry dan menghasilkan laporan keuangan yang seimbang. Manfaatnya adalah menyediakan rujukan praktis penerapan trigger basis data untuk menjamin integritas data akuntansi pada aplikasi UMKM.</w:t>
+        <w:t>Untuk mengatasi permasalahan tersebut, penelitian ini membangun SIA berbasis web yang mengotomatiskan penjurnalan pada level basis data menggunakan mekanisme database trigger, dengan studi kasus TechSolve Consulting (UMKM fiktif jasa konsultan teknologi informasi). Setiap transaksi yang dimasukkan otomatis membentuk entri buku jurnal tanpa intervensi manual. Tujuan penelitian adalah merancang dan menguji sistem tersebut dalam menjaga prinsip double-entry serta menghasilkan laporan keuangan yang seimbang, sekaligus menyediakan rujukan praktis penerapan trigger untuk menjamin integritas data akuntansi pada UMKM.</w:t>
       </w:r>
     </w:p>
     <w:p>
@@ -260,23 +244,7 @@
           <w:i w:val="0"/>
           <w:sz w:val="20"/>
         </w:rPr>
-        <w:t>Next.js merupakan kerangka kerja berbasis React yang mendukung perenderan di sisi server (server-side rendering) serta penyediaan antarmuka pemrograman aplikasi (API) dalam satu basis kode [SITASI-6]. Kombinasi Next.js dan MySQL memungkinkan pembangunan aplikasi web yang ringkas namun tetap memisahkan lapisan antarmuka, logika bisnis, dan penyimpanan data.</w:t>
-      </w:r>
-    </w:p>
-    <w:p>
-      <w:pPr>
-        <w:spacing w:line="240" w:lineRule="auto" w:before="0" w:after="80"/>
-        <w:ind w:firstLine="425"/>
-        <w:jc w:val="both"/>
-      </w:pPr>
-      <w:r>
-        <w:rPr>
-          <w:rFonts w:ascii="Times New Roman" w:hAnsi="Times New Roman"/>
-          <w:b w:val="0"/>
-          <w:i w:val="0"/>
-          <w:sz w:val="20"/>
-        </w:rPr>
-        <w:t>Beberapa penelitian terdahulu telah membahas pengembangan aplikasi akuntansi dan sistem informasi sejenis untuk UMKM [SITASI-7], penerapan otomatisasi pada pengolahan data transaksi [SITASI-8], serta pemanfaatan trigger basis data untuk menjaga konsistensi data [SITASI-9]. Penelitian ini melengkapi kajian tersebut dengan menekankan otomatisasi penjurnalan double-entry sepenuhnya pada level trigger MySQL.</w:t>
+        <w:t>Next.js merupakan kerangka kerja berbasis React yang mendukung perenderan sisi server dan penyediaan API dalam satu basis kode [SITASI-6], sehingga memisahkan lapisan antarmuka, logika bisnis, dan penyimpanan data secara ringkas. Penelitian terdahulu telah membahas pengembangan aplikasi akuntansi untuk UMKM [SITASI-7], otomatisasi pengolahan data transaksi [SITASI-8], serta pemanfaatan trigger untuk menjaga konsistensi data [SITASI-9]. Penelitian ini melengkapi kajian tersebut dengan menekankan otomatisasi penjurnalan double-entry sepenuhnya pada level trigger MySQL.</w:t>
       </w:r>
     </w:p>
     <w:p>
@@ -722,7 +690,7 @@
           <w:i w:val="0"/>
           <w:sz w:val="20"/>
         </w:rPr>
-        <w:t>Basis data dirancang dengan empat tabel utama. Tabel chart_of_accounts menyimpan daftar akun beserta kategori dan saldo normalnya. Tabel transactions menyimpan kepala (header) transaksi, sedangkan transaction_details menyimpan baris debit dan kredit. Tabel journal_entries menampung buku jurnal yang seluruhnya diisi otomatis oleh trigger. Sebuah kolom penghubung ref_detail_id ditambahkan pada tabel jurnal untuk menautkan setiap baris detail dengan tepat satu entri jurnal (relasi satu-ke-satu) sehingga operasi pembaruan dan penghapusan menjadi presisi. Struktur akun dan relasi tabel disajikan pada Tabel 2 dan Gambar 1.</w:t>
+        <w:t>Basis data dirancang dengan empat tabel utama (Tabel 2 dan Gambar 1): chart_of_accounts (master akun), transactions (header transaksi), transaction_details (baris debit/kredit), dan journal_entries (buku jurnal yang diisi otomatis oleh trigger). Kolom penghubung ref_detail_id ditambahkan pada tabel jurnal untuk menautkan setiap baris detail dengan tepat satu entri jurnal (relasi satu-ke-satu), sehingga operasi pembaruan dan penghapusan menjadi presisi.</w:t>
       </w:r>
     </w:p>
     <w:p>
@@ -1657,204 +1625,93 @@
           <w:i w:val="0"/>
           <w:sz w:val="20"/>
         </w:rPr>
-        <w:t>Sistem berhasil diimplementasikan dengan lima fitur utama, yaitu pengelolaan daftar akun (CRUD Chart of Accounts), input transaksi dengan validasi double-entry, jurnal umum, buku besar dengan saldo berjalan, serta tiga laporan keuangan otomatis. Tampilan tiap fitur ditunjukkan pada Gambar 2 hingga Gambar 8.</w:t>
+        <w:t>Sistem berhasil diimplementasikan dengan lima fitur utama, yaitu pengelolaan daftar akun (CRUD Chart of Accounts), input transaksi dengan validasi double-entry, jurnal umum, buku besar dengan saldo berjalan, serta tiga laporan keuangan otomatis. Cuplikan antarmuka fitur utama ditunjukkan pada Gambar 2 dan Gambar 3.</w:t>
       </w:r>
     </w:p>
+    <w:tbl>
+      <w:tblPr>
+        <w:tblStyle w:val="TableGrid"/>
+        <w:tblW w:type="auto" w:w="0"/>
+        <w:jc w:val="center"/>
+        <w:tblLook w:firstColumn="1" w:firstRow="1" w:lastColumn="0" w:lastRow="0" w:noHBand="0" w:noVBand="1" w:val="04A0"/>
+      </w:tblPr>
+      <w:tblGrid>
+        <w:gridCol w:w="4680"/>
+        <w:gridCol w:w="4680"/>
+      </w:tblGrid>
+      <w:tr>
+        <w:tc>
+          <w:tcPr>
+            <w:tcW w:type="dxa" w:w="4680"/>
+          </w:tcPr>
+          <w:p>
+            <w:pPr>
+              <w:spacing w:line="240" w:lineRule="auto" w:before="0" w:after="20"/>
+              <w:jc w:val="center"/>
+            </w:pPr>
+            <w:r>
+              <w:rPr>
+                <w:rFonts w:ascii="Times New Roman" w:hAnsi="Times New Roman"/>
+                <w:color w:val="888888"/>
+                <w:sz w:val="16"/>
+              </w:rPr>
+              <w:t>[ TEMPATKAN GAMBAR ]</w:t>
+            </w:r>
+          </w:p>
+          <w:p>
+            <w:pPr>
+              <w:spacing w:line="240" w:lineRule="auto" w:before="0" w:after="20"/>
+              <w:jc w:val="center"/>
+            </w:pPr>
+            <w:r>
+              <w:rPr>
+                <w:rFonts w:ascii="Times New Roman" w:hAnsi="Times New Roman"/>
+                <w:i/>
+                <w:sz w:val="17"/>
+              </w:rPr>
+              <w:t>Gambar 2. Form Input Transaksi (Validasi Double-Entry)</w:t>
+            </w:r>
+          </w:p>
+        </w:tc>
+        <w:tc>
+          <w:tcPr>
+            <w:tcW w:type="dxa" w:w="4680"/>
+          </w:tcPr>
+          <w:p>
+            <w:pPr>
+              <w:spacing w:line="240" w:lineRule="auto" w:before="0" w:after="20"/>
+              <w:jc w:val="center"/>
+            </w:pPr>
+            <w:r>
+              <w:rPr>
+                <w:rFonts w:ascii="Times New Roman" w:hAnsi="Times New Roman"/>
+                <w:color w:val="888888"/>
+                <w:sz w:val="16"/>
+              </w:rPr>
+              <w:t>[ TEMPATKAN GAMBAR ]</w:t>
+            </w:r>
+          </w:p>
+          <w:p>
+            <w:pPr>
+              <w:spacing w:line="240" w:lineRule="auto" w:before="0" w:after="20"/>
+              <w:jc w:val="center"/>
+            </w:pPr>
+            <w:r>
+              <w:rPr>
+                <w:rFonts w:ascii="Times New Roman" w:hAnsi="Times New Roman"/>
+                <w:i/>
+                <w:sz w:val="17"/>
+              </w:rPr>
+              <w:t>Gambar 3. Laporan Neraca (Seimbang)</w:t>
+            </w:r>
+          </w:p>
+        </w:tc>
+      </w:tr>
+    </w:tbl>
     <w:p>
       <w:pPr>
         <w:spacing w:line="240" w:lineRule="auto" w:before="0" w:after="40"/>
-        <w:jc w:val="center"/>
       </w:pPr>
-      <w:r>
-        <w:rPr>
-          <w:rFonts w:ascii="Times New Roman" w:hAnsi="Times New Roman"/>
-          <w:color w:val="888888"/>
-          <w:sz w:val="18"/>
-        </w:rPr>
-        <w:t>[ TEMPATKAN GAMBAR DI SINI ]</w:t>
-      </w:r>
-    </w:p>
-    <w:p>
-      <w:pPr>
-        <w:spacing w:line="240" w:lineRule="auto" w:before="0" w:after="120"/>
-        <w:jc w:val="center"/>
-      </w:pPr>
-      <w:r>
-        <w:rPr>
-          <w:rFonts w:ascii="Times New Roman" w:hAnsi="Times New Roman"/>
-          <w:i/>
-          <w:sz w:val="18"/>
-        </w:rPr>
-        <w:t>Gambar 2. Halaman Dashboard</w:t>
-      </w:r>
-    </w:p>
-    <w:p>
-      <w:pPr>
-        <w:spacing w:line="240" w:lineRule="auto" w:before="0" w:after="40"/>
-        <w:jc w:val="center"/>
-      </w:pPr>
-      <w:r>
-        <w:rPr>
-          <w:rFonts w:ascii="Times New Roman" w:hAnsi="Times New Roman"/>
-          <w:color w:val="888888"/>
-          <w:sz w:val="18"/>
-        </w:rPr>
-        <w:t>[ TEMPATKAN GAMBAR DI SINI ]</w:t>
-      </w:r>
-    </w:p>
-    <w:p>
-      <w:pPr>
-        <w:spacing w:line="240" w:lineRule="auto" w:before="0" w:after="120"/>
-        <w:jc w:val="center"/>
-      </w:pPr>
-      <w:r>
-        <w:rPr>
-          <w:rFonts w:ascii="Times New Roman" w:hAnsi="Times New Roman"/>
-          <w:i/>
-          <w:sz w:val="18"/>
-        </w:rPr>
-        <w:t>Gambar 3. Form Input Transaksi dengan Validasi Double-Entry</w:t>
-      </w:r>
-    </w:p>
-    <w:p>
-      <w:pPr>
-        <w:spacing w:line="240" w:lineRule="auto" w:before="0" w:after="40"/>
-        <w:jc w:val="center"/>
-      </w:pPr>
-      <w:r>
-        <w:rPr>
-          <w:rFonts w:ascii="Times New Roman" w:hAnsi="Times New Roman"/>
-          <w:color w:val="888888"/>
-          <w:sz w:val="18"/>
-        </w:rPr>
-        <w:t>[ TEMPATKAN GAMBAR DI SINI ]</w:t>
-      </w:r>
-    </w:p>
-    <w:p>
-      <w:pPr>
-        <w:spacing w:line="240" w:lineRule="auto" w:before="0" w:after="120"/>
-        <w:jc w:val="center"/>
-      </w:pPr>
-      <w:r>
-        <w:rPr>
-          <w:rFonts w:ascii="Times New Roman" w:hAnsi="Times New Roman"/>
-          <w:i/>
-          <w:sz w:val="18"/>
-        </w:rPr>
-        <w:t>Gambar 4. Jurnal Umum</w:t>
-      </w:r>
-    </w:p>
-    <w:p>
-      <w:pPr>
-        <w:spacing w:line="240" w:lineRule="auto" w:before="0" w:after="40"/>
-        <w:jc w:val="center"/>
-      </w:pPr>
-      <w:r>
-        <w:rPr>
-          <w:rFonts w:ascii="Times New Roman" w:hAnsi="Times New Roman"/>
-          <w:color w:val="888888"/>
-          <w:sz w:val="18"/>
-        </w:rPr>
-        <w:t>[ TEMPATKAN GAMBAR DI SINI ]</w:t>
-      </w:r>
-    </w:p>
-    <w:p>
-      <w:pPr>
-        <w:spacing w:line="240" w:lineRule="auto" w:before="0" w:after="120"/>
-        <w:jc w:val="center"/>
-      </w:pPr>
-      <w:r>
-        <w:rPr>
-          <w:rFonts w:ascii="Times New Roman" w:hAnsi="Times New Roman"/>
-          <w:i/>
-          <w:sz w:val="18"/>
-        </w:rPr>
-        <w:t>Gambar 5. Buku Besar dengan Saldo Berjalan</w:t>
-      </w:r>
-    </w:p>
-    <w:p>
-      <w:pPr>
-        <w:spacing w:line="240" w:lineRule="auto" w:before="0" w:after="40"/>
-        <w:jc w:val="center"/>
-      </w:pPr>
-      <w:r>
-        <w:rPr>
-          <w:rFonts w:ascii="Times New Roman" w:hAnsi="Times New Roman"/>
-          <w:color w:val="888888"/>
-          <w:sz w:val="18"/>
-        </w:rPr>
-        <w:t>[ TEMPATKAN GAMBAR DI SINI ]</w:t>
-      </w:r>
-    </w:p>
-    <w:p>
-      <w:pPr>
-        <w:spacing w:line="240" w:lineRule="auto" w:before="0" w:after="120"/>
-        <w:jc w:val="center"/>
-      </w:pPr>
-      <w:r>
-        <w:rPr>
-          <w:rFonts w:ascii="Times New Roman" w:hAnsi="Times New Roman"/>
-          <w:i/>
-          <w:sz w:val="18"/>
-        </w:rPr>
-        <w:t>Gambar 6. Laporan Laba Rugi</w:t>
-      </w:r>
-    </w:p>
-    <w:p>
-      <w:pPr>
-        <w:spacing w:line="240" w:lineRule="auto" w:before="0" w:after="40"/>
-        <w:jc w:val="center"/>
-      </w:pPr>
-      <w:r>
-        <w:rPr>
-          <w:rFonts w:ascii="Times New Roman" w:hAnsi="Times New Roman"/>
-          <w:color w:val="888888"/>
-          <w:sz w:val="18"/>
-        </w:rPr>
-        <w:t>[ TEMPATKAN GAMBAR DI SINI ]</w:t>
-      </w:r>
-    </w:p>
-    <w:p>
-      <w:pPr>
-        <w:spacing w:line="240" w:lineRule="auto" w:before="0" w:after="120"/>
-        <w:jc w:val="center"/>
-      </w:pPr>
-      <w:r>
-        <w:rPr>
-          <w:rFonts w:ascii="Times New Roman" w:hAnsi="Times New Roman"/>
-          <w:i/>
-          <w:sz w:val="18"/>
-        </w:rPr>
-        <w:t>Gambar 7. Laporan Perubahan Modal</w:t>
-      </w:r>
-    </w:p>
-    <w:p>
-      <w:pPr>
-        <w:spacing w:line="240" w:lineRule="auto" w:before="0" w:after="40"/>
-        <w:jc w:val="center"/>
-      </w:pPr>
-      <w:r>
-        <w:rPr>
-          <w:rFonts w:ascii="Times New Roman" w:hAnsi="Times New Roman"/>
-          <w:color w:val="888888"/>
-          <w:sz w:val="18"/>
-        </w:rPr>
-        <w:t>[ TEMPATKAN GAMBAR DI SINI ]</w:t>
-      </w:r>
-    </w:p>
-    <w:p>
-      <w:pPr>
-        <w:spacing w:line="240" w:lineRule="auto" w:before="0" w:after="120"/>
-        <w:jc w:val="center"/>
-      </w:pPr>
-      <w:r>
-        <w:rPr>
-          <w:rFonts w:ascii="Times New Roman" w:hAnsi="Times New Roman"/>
-          <w:i/>
-          <w:sz w:val="18"/>
-        </w:rPr>
-        <w:t>Gambar 8. Neraca</w:t>
-      </w:r>
     </w:p>
     <w:p>
       <w:pPr>
@@ -2626,7 +2483,7 @@
           <w:i w:val="0"/>
           <w:sz w:val="20"/>
         </w:rPr>
-        <w:t>Pengujian keandalan trigger dilakukan terhadap tiga operasi data dan hasilnya dirangkum pada Tabel 4. Penambahan satu transaksi seimbang menambah dua entri jurnal (14 menjadi 16); pengubahan nominal transaksi memperbarui nilai pada entri jurnal terkait; dan penghapusan transaksi mengembalikan jumlah entri jurnal ke kondisi semula (16 menjadi 14). Transaksi dengan total debit dan kredit tidak seimbang berhasil ditolak oleh sistem.</w:t>
+        <w:t>Pengujian keandalan trigger terhadap tiga operasi data dirangkum pada Tabel 4. Penambahan transaksi seimbang menambah dua entri jurnal (14→16), pengubahan nominal memperbarui entri jurnal terkait, dan penghapusan mengembalikan jumlah entri ke kondisi semula (16→14). Transaksi dengan debit dan kredit tidak seimbang berhasil ditolak.</w:t>
       </w:r>
     </w:p>
     <w:p>
@@ -3032,7 +2889,7 @@
           <w:i w:val="0"/>
           <w:sz w:val="20"/>
         </w:rPr>
-        <w:t>Laporan keuangan yang dihasilkan dari data jurnal menunjukkan hasil yang konsisten dan seimbang, sebagaimana dirangkum pada Tabel 5. Total pendapatan sebesar Rp8.000.000 dikurangi total beban Rp4.500.000 menghasilkan laba bersih Rp3.500.000. Modal akhir sebesar Rp52.500.000 diperoleh dari modal awal Rp50.000.000 ditambah laba bersih dan dikurangi prive Rp1.000.000. Neraca menunjukkan total aset sama dengan total kewajiban dan ekuitas sebesar Rp52.500.000, sehingga persamaan akuntansi terpenuhi.</w:t>
+        <w:t>Laporan keuangan yang dihasilkan dari data jurnal konsisten dan seimbang (Tabel 5). Total pendapatan Rp8.000.000 dikurangi total beban Rp4.500.000 menghasilkan laba bersih Rp3.500.000. Modal akhir Rp52.500.000 berasal dari modal awal Rp50.000.000 ditambah laba bersih dikurangi prive Rp1.000.000. Neraca menunjukkan total aset sama dengan kewajiban ditambah ekuitas sebesar Rp52.500.000, sehingga persamaan akuntansi terpenuhi.</w:t>
       </w:r>
     </w:p>
     <w:p>
@@ -3521,7 +3378,7 @@
           <w:i/>
           <w:sz w:val="18"/>
         </w:rPr>
-        <w:t>Gambar 9. Output SHOW TRIGGERS pada MySQL Workbench (Bukti Trigger)</w:t>
+        <w:t>Gambar 4. Output SHOW TRIGGERS pada MySQL Workbench (Bukti Trigger)</w:t>
       </w:r>
     </w:p>
     <w:p>

</xml_diff>

<commit_message>
Artikel: isi Daftar Pustaka dengan 8 referensi terverifikasi + pemetaan penanda sitasi
</commit_message>
<xml_diff>
--- a/docs/artikel/artikel_ilmiah_sia.docx
+++ b/docs/artikel/artikel_ilmiah_sia.docx
@@ -3442,122 +3442,126 @@
     <w:p>
       <w:pPr>
         <w:spacing w:line="240" w:lineRule="auto" w:before="0" w:after="80"/>
-        <w:jc w:val="both"/>
       </w:pPr>
       <w:r>
         <w:rPr>
           <w:rFonts w:ascii="Times New Roman" w:hAnsi="Times New Roman"/>
-          <w:sz w:val="20"/>
+          <w:i/>
+          <w:sz w:val="18"/>
         </w:rPr>
-        <w:t>Catatan: penanda [SITASI-1] s.d. [SITASI-9] pada naskah perlu diganti dengan sitasi sebenarnya melalui Mendeley. Daftar di bawah adalah peta topik tiap penanda; isi referensi final akan menyusul setelah verifikasi sumber yang sahih.</w:t>
+        <w:t>Pemetaan penanda sitasi (isi sitasi dalam teks via Mendeley sesuai peta ini): [SITASI-1] dan [SITASI-7] -&gt; Firdaus &amp; Widyasastrena (2017); [SITASI-2] -&gt; Nugraha dkk. (2023); [SITASI-3] dan [SITASI-8] -&gt; Ramadani dkk. (2025); [SITASI-4] -&gt; Anggraeni &amp; Priatna (2019); [SITASI-5] -&gt; Dedianto (2013); [SITASI-6] -&gt; Maharani (2025) dan Naresvari &amp; Susetyo (2025); [SITASI-9] -&gt; Arief (2010).</w:t>
       </w:r>
     </w:p>
     <w:p>
       <w:pPr>
-        <w:spacing w:line="240" w:lineRule="auto" w:before="0" w:after="20"/>
+        <w:spacing w:line="240" w:lineRule="auto" w:before="0" w:after="40"/>
+        <w:ind w:left="425" w:hanging="425"/>
+        <w:jc w:val="both"/>
       </w:pPr>
       <w:r>
         <w:rPr>
           <w:rFonts w:ascii="Times New Roman" w:hAnsi="Times New Roman"/>
           <w:sz w:val="18"/>
         </w:rPr>
-        <w:t>[SITASI-1] Definisi/konsep Sistem Informasi Akuntansi.</w:t>
+        <w:t>Anggraeni, I., &amp; Priatna, H. (2019). Pentingnya double entry system dalam akuntansi perusahaan. AKURAT: Jurnal Ilmiah Akuntansi FE UNIBBA, 10(1), 90-98.</w:t>
       </w:r>
     </w:p>
     <w:p>
       <w:pPr>
-        <w:spacing w:line="240" w:lineRule="auto" w:before="0" w:after="20"/>
+        <w:spacing w:line="240" w:lineRule="auto" w:before="0" w:after="40"/>
+        <w:ind w:left="425" w:hanging="425"/>
+        <w:jc w:val="both"/>
       </w:pPr>
       <w:r>
         <w:rPr>
           <w:rFonts w:ascii="Times New Roman" w:hAnsi="Times New Roman"/>
           <w:sz w:val="18"/>
         </w:rPr>
-        <w:t>[SITASI-2] Peran SIA bagi UMKM / kebutuhan informasi keuangan.</w:t>
+        <w:t>Arief, M. R. (2010). Implementasi constraint untuk menjamin konsistensi dan integritas data dalam database. Jurnal DASI, 11(2). STMIK AMIKOM Yogyakarta.</w:t>
       </w:r>
     </w:p>
     <w:p>
       <w:pPr>
-        <w:spacing w:line="240" w:lineRule="auto" w:before="0" w:after="20"/>
+        <w:spacing w:line="240" w:lineRule="auto" w:before="0" w:after="40"/>
+        <w:ind w:left="425" w:hanging="425"/>
+        <w:jc w:val="both"/>
       </w:pPr>
       <w:r>
         <w:rPr>
           <w:rFonts w:ascii="Times New Roman" w:hAnsi="Times New Roman"/>
           <w:sz w:val="18"/>
         </w:rPr>
-        <w:t>[SITASI-3] Kelemahan pencatatan manual / human error.</w:t>
+        <w:t>Dedianto. (2013). Sistem trigger database pada SIAKAD Informatika. JUSTIN (Jurnal Sistem dan Teknologi Informasi), 1(1). Universitas Tanjungpura.</w:t>
       </w:r>
     </w:p>
     <w:p>
       <w:pPr>
-        <w:spacing w:line="240" w:lineRule="auto" w:before="0" w:after="20"/>
+        <w:spacing w:line="240" w:lineRule="auto" w:before="0" w:after="40"/>
+        <w:ind w:left="425" w:hanging="425"/>
+        <w:jc w:val="both"/>
       </w:pPr>
       <w:r>
         <w:rPr>
           <w:rFonts w:ascii="Times New Roman" w:hAnsi="Times New Roman"/>
           <w:sz w:val="18"/>
         </w:rPr>
-        <w:t>[SITASI-4] Prinsip double-entry bookkeeping.</w:t>
+        <w:t>Firdaus, D. W., &amp; Widyasastrena, D. (2017). Perancangan sistem informasi akuntansi koperasi dan UMKM berbasis technopreneur. Jurnal Riset Akuntansi dan Keuangan, 5(2), 1423-1440. https://doi.org/10.17509/jrak.v5i2.8124</w:t>
       </w:r>
     </w:p>
     <w:p>
       <w:pPr>
-        <w:spacing w:line="240" w:lineRule="auto" w:before="0" w:after="20"/>
+        <w:spacing w:line="240" w:lineRule="auto" w:before="0" w:after="40"/>
+        <w:ind w:left="425" w:hanging="425"/>
+        <w:jc w:val="both"/>
       </w:pPr>
       <w:r>
         <w:rPr>
           <w:rFonts w:ascii="Times New Roman" w:hAnsi="Times New Roman"/>
           <w:sz w:val="18"/>
         </w:rPr>
-        <w:t>[SITASI-5] Database trigger (definisi &amp; jenis pada MySQL).</w:t>
+        <w:t>Maharani, P. (2025). Pengembangan website PT. Rantangin Digital Indonesia menggunakan framework Next.js dan Tailwind CSS. Repeater: Publikasi Teknik Informatika dan Jaringan, 3(1), 129-137. https://doi.org/10.62951/repeater.v3i1.355</w:t>
       </w:r>
     </w:p>
     <w:p>
       <w:pPr>
-        <w:spacing w:line="240" w:lineRule="auto" w:before="0" w:after="20"/>
+        <w:spacing w:line="240" w:lineRule="auto" w:before="0" w:after="40"/>
+        <w:ind w:left="425" w:hanging="425"/>
+        <w:jc w:val="both"/>
       </w:pPr>
       <w:r>
         <w:rPr>
           <w:rFonts w:ascii="Times New Roman" w:hAnsi="Times New Roman"/>
           <w:sz w:val="18"/>
         </w:rPr>
-        <w:t>[SITASI-6] Next.js / React untuk aplikasi web.</w:t>
+        <w:t>Naresvari, E., &amp; Susetyo, Y. A. (2025). Penerapan JavaScript React pada perancangan front-end website UMKM Jemari Ragil. IT-Explore: Jurnal Penerapan Teknologi Informasi dan Komunikasi, 4(1), 16-32. https://doi.org/10.24246/itexplore.v4i1.2025.pp16-32</w:t>
       </w:r>
     </w:p>
     <w:p>
       <w:pPr>
-        <w:spacing w:line="240" w:lineRule="auto" w:before="0" w:after="20"/>
+        <w:spacing w:line="240" w:lineRule="auto" w:before="0" w:after="40"/>
+        <w:ind w:left="425" w:hanging="425"/>
+        <w:jc w:val="both"/>
       </w:pPr>
       <w:r>
         <w:rPr>
           <w:rFonts w:ascii="Times New Roman" w:hAnsi="Times New Roman"/>
           <w:sz w:val="18"/>
         </w:rPr>
-        <w:t>[SITASI-7] Studi terkait: aplikasi akuntansi/SIA untuk UMKM.</w:t>
+        <w:t>Nugraha, N., Budiyono, I., Nurhayati, I., &amp; Arumsari, V. (2023). Pemanfaatan sistem informasi akuntansi pada UMKM di Kota Semarang. KEUNIS, 11(1), 95-104. https://doi.org/10.32497/keunis.v11i1.4079</w:t>
       </w:r>
     </w:p>
     <w:p>
       <w:pPr>
-        <w:spacing w:line="240" w:lineRule="auto" w:before="0" w:after="20"/>
+        <w:spacing w:line="240" w:lineRule="auto" w:before="0" w:after="40"/>
+        <w:ind w:left="425" w:hanging="425"/>
+        <w:jc w:val="both"/>
       </w:pPr>
       <w:r>
         <w:rPr>
           <w:rFonts w:ascii="Times New Roman" w:hAnsi="Times New Roman"/>
           <w:sz w:val="18"/>
         </w:rPr>
-        <w:t>[SITASI-8] Studi terkait: otomatisasi pengolahan data transaksi.</w:t>
-      </w:r>
-    </w:p>
-    <w:p>
-      <w:pPr>
-        <w:spacing w:line="240" w:lineRule="auto" w:before="0" w:after="20"/>
-      </w:pPr>
-      <w:r>
-        <w:rPr>
-          <w:rFonts w:ascii="Times New Roman" w:hAnsi="Times New Roman"/>
-          <w:sz w:val="18"/>
-        </w:rPr>
-        <w:t>[SITASI-9] Studi terkait: pemanfaatan trigger untuk integritas data.</w:t>
+        <w:t>Ramadani, F., Budianto, F., Saputra, M. D., &amp; Faizah, Y. L. N. (2025). Penerapan sistem informasi akuntansi berbasis web pada UMKM (Studi kasus: Diska Beauty Salon). DEVICE: Journal of Information System, Computer Science and Information Technology, 6(2). https://doi.org/10.46576/device.v6i2.7206</w:t>
       </w:r>
     </w:p>
     <w:sectPr>

</xml_diff>

<commit_message>
Artikel: semua referensi kini ber-DOI (ganti 3 sumber tanpa-DOI dgn jurnal ber-DOI)
</commit_message>
<xml_diff>
--- a/docs/artikel/artikel_ilmiah_sia.docx
+++ b/docs/artikel/artikel_ilmiah_sia.docx
@@ -3449,7 +3449,7 @@
           <w:i/>
           <w:sz w:val="18"/>
         </w:rPr>
-        <w:t>Pemetaan penanda sitasi (isi sitasi dalam teks via Mendeley sesuai peta ini): [SITASI-1] dan [SITASI-7] -&gt; Firdaus &amp; Widyasastrena (2017); [SITASI-2] -&gt; Nugraha dkk. (2023); [SITASI-3] dan [SITASI-8] -&gt; Ramadani dkk. (2025); [SITASI-4] -&gt; Anggraeni &amp; Priatna (2019); [SITASI-5] -&gt; Dedianto (2013); [SITASI-6] -&gt; Maharani (2025) dan Naresvari &amp; Susetyo (2025); [SITASI-9] -&gt; Arief (2010).</w:t>
+        <w:t>Pemetaan penanda sitasi (isi sitasi dalam teks via Mendeley sesuai peta ini): [SITASI-1] dan [SITASI-7] -&gt; Firdaus &amp; Widyasastrena (2017); [SITASI-2] -&gt; Nugraha dkk. (2023); [SITASI-3] dan [SITASI-8] -&gt; Ramadani dkk. (2025); [SITASI-4] -&gt; Prasetyo (2013); [SITASI-5] dan [SITASI-9] -&gt; Aidjili (2025); [SITASI-6] -&gt; Maharani (2025) dan Naresvari &amp; Susetyo (2025).</w:t>
       </w:r>
     </w:p>
     <w:p>
@@ -3463,35 +3463,7 @@
           <w:rFonts w:ascii="Times New Roman" w:hAnsi="Times New Roman"/>
           <w:sz w:val="18"/>
         </w:rPr>
-        <w:t>Anggraeni, I., &amp; Priatna, H. (2019). Pentingnya double entry system dalam akuntansi perusahaan. AKURAT: Jurnal Ilmiah Akuntansi FE UNIBBA, 10(1), 90-98.</w:t>
-      </w:r>
-    </w:p>
-    <w:p>
-      <w:pPr>
-        <w:spacing w:line="240" w:lineRule="auto" w:before="0" w:after="40"/>
-        <w:ind w:left="425" w:hanging="425"/>
-        <w:jc w:val="both"/>
-      </w:pPr>
-      <w:r>
-        <w:rPr>
-          <w:rFonts w:ascii="Times New Roman" w:hAnsi="Times New Roman"/>
-          <w:sz w:val="18"/>
-        </w:rPr>
-        <w:t>Arief, M. R. (2010). Implementasi constraint untuk menjamin konsistensi dan integritas data dalam database. Jurnal DASI, 11(2). STMIK AMIKOM Yogyakarta.</w:t>
-      </w:r>
-    </w:p>
-    <w:p>
-      <w:pPr>
-        <w:spacing w:line="240" w:lineRule="auto" w:before="0" w:after="40"/>
-        <w:ind w:left="425" w:hanging="425"/>
-        <w:jc w:val="both"/>
-      </w:pPr>
-      <w:r>
-        <w:rPr>
-          <w:rFonts w:ascii="Times New Roman" w:hAnsi="Times New Roman"/>
-          <w:sz w:val="18"/>
-        </w:rPr>
-        <w:t>Dedianto. (2013). Sistem trigger database pada SIAKAD Informatika. JUSTIN (Jurnal Sistem dan Teknologi Informasi), 1(1). Universitas Tanjungpura.</w:t>
+        <w:t>Aidjili, M. (2025). Implementasi trigger dan view untuk mendukung konsistensi dan efisiensi pengolahan data pada sistem database (Studi kasus: Toko Nanda Pekalongan). Jurnal Komputer, Informasi dan Teknologi, 5(2). https://doi.org/10.53697/jkomitek.v5i2.3940</w:t>
       </w:r>
     </w:p>
     <w:p>
@@ -3548,6 +3520,20 @@
           <w:sz w:val="18"/>
         </w:rPr>
         <w:t>Nugraha, N., Budiyono, I., Nurhayati, I., &amp; Arumsari, V. (2023). Pemanfaatan sistem informasi akuntansi pada UMKM di Kota Semarang. KEUNIS, 11(1), 95-104. https://doi.org/10.32497/keunis.v11i1.4079</w:t>
+      </w:r>
+    </w:p>
+    <w:p>
+      <w:pPr>
+        <w:spacing w:line="240" w:lineRule="auto" w:before="0" w:after="40"/>
+        <w:ind w:left="425" w:hanging="425"/>
+        <w:jc w:val="both"/>
+      </w:pPr>
+      <w:r>
+        <w:rPr>
+          <w:rFonts w:ascii="Times New Roman" w:hAnsi="Times New Roman"/>
+          <w:sz w:val="18"/>
+        </w:rPr>
+        <w:t>Prasetyo, W. (2013). Membongkar akuntansi double entry systems. Jurnal Akuntansi Multiparadigma, 4(2), 308-321. https://doi.org/10.18202/jamal.2013.08.7199</w:t>
       </w:r>
     </w:p>
     <w:p>

</xml_diff>